<commit_message>
docs: sync source documents with M5 decisions (Compress LOCAL, PDF to Word V1.1)
Architecture: Compress PDF is LOCAL with an on-device engine; PDF to Word
deferred. PRD, master plan, QA strategy and roadmap record the DEFER outcome.
Ten in-place line edits; only word/document.xml changed in each file.
M5B ADR, report, ADR index and governance table marked accepted; M5 complete.

Claude-Session: https://claude.ai/code/session_01BQ3DWFvzRxxWLeNuArDQ2u
</commit_message>
<xml_diff>
--- a/docs/01_Master_Product_Plan_Document_File_Platform.docx
+++ b/docs/01_Master_Product_Plan_Document_File_Platform.docx
@@ -1259,7 +1259,7 @@
                 <w:b w:val="0"/>
                 <w:sz w:val="18"/>
               </w:rPr>
-              <w:t>PDF to Word; Word to PDF; PDF to JPG; JPG/Images to PDF</w:t>
+              <w:t>Word to PDF; PDF to JPG; JPG/Images to PDF</w:t>
             </w:r>
           </w:p>
         </w:tc>
@@ -1537,7 +1537,7 @@
                 <w:b w:val="0"/>
                 <w:sz w:val="18"/>
               </w:rPr>
-              <w:t>OCR, PDF to Excel, PDF to Markdown, protect/unlock, watermark, page numbers, repair</w:t>
+              <w:t>PDF to Word, OCR, PDF to Excel, PDF to Markdown, protect/unlock, watermark, page numbers, repair</w:t>
             </w:r>
           </w:p>
         </w:tc>

</xml_diff>

<commit_message>
docs: sync source documents with M5 decisions (Compress LOCAL, PDF to Word V1.1) (#22)
Compress PDF is LOCAL and PDF to Word is V1.1 in the architecture, PRD, master plan, QA strategy and roadmap (ten in-place line edits). M5B ADR, report, index and governance table marked accepted; M5 complete.

Claude-Session: https://claude.ai/code/session_01BQ3DWFvzRxxWLeNuArDQ2u
</commit_message>
<xml_diff>
--- a/docs/01_Master_Product_Plan_Document_File_Platform.docx
+++ b/docs/01_Master_Product_Plan_Document_File_Platform.docx
@@ -1259,7 +1259,7 @@
                 <w:b w:val="0"/>
                 <w:sz w:val="18"/>
               </w:rPr>
-              <w:t>PDF to Word; Word to PDF; PDF to JPG; JPG/Images to PDF</w:t>
+              <w:t>Word to PDF; PDF to JPG; JPG/Images to PDF</w:t>
             </w:r>
           </w:p>
         </w:tc>
@@ -1537,7 +1537,7 @@
                 <w:b w:val="0"/>
                 <w:sz w:val="18"/>
               </w:rPr>
-              <w:t>OCR, PDF to Excel, PDF to Markdown, protect/unlock, watermark, page numbers, repair</w:t>
+              <w:t>PDF to Word, OCR, PDF to Excel, PDF to Markdown, protect/unlock, watermark, page numbers, repair</w:t>
             </w:r>
           </w:p>
         </w:tc>

</xml_diff>